<commit_message>
docs(catatan-28-sederhana): rapikan bahasa baku & susun ulang pola pengantar→tabel/gambar→penjelasan
- istilah konsisten (ponsel/smartwatch), tanpa kapital-teriak, ejaan & tanda baca dibakukan
- tiap tabel/gambar dibungkus kalimat pengantar dan penjelasan hasilnya
</commit_message>
<xml_diff>
--- a/docs/26-06-28-Catatan-Faik-BLE-SmartWatch-sederhana.docx
+++ b/docs/26-06-28-Catatan-Faik-BLE-SmartWatch-sederhana.docx
@@ -8,7 +8,7 @@
           <w:b/>
           <w:sz w:val="26"/>
         </w:rPr>
-        <w:t>CATATAN HASIL UJI — KIRIM DATA DETAK JANTUNG &amp; TEMUAN PENTING</w:t>
+        <w:t>CATATAN HASIL UJI — PENGIRIMAN DATA DETAK JANTUNG DAN TEMUAN PENTING</w:t>
       </w:r>
     </w:p>
     <w:p>
@@ -26,12 +26,12 @@
           <w:b/>
           <w:sz w:val="24"/>
         </w:rPr>
-        <w:t>Cara Mengambil Datanya</w:t>
+        <w:t>Pengambilan Data</w:t>
       </w:r>
     </w:p>
     <w:p>
       <w:r>
-        <w:t>Data diambil langsung dari kedua alat lewat adb (aplikasi versi rilis): file CSV hasil ekspor disalin dari folder Download. Smartwatch-nya Samsung Galaxy Watch (SM-R860), HP-nya Xiaomi Redmi Note 10 Pro. File mentahnya: watch-2026-06-28.csv (45.446 baris) dan phone-2026-06-28.csv (42.562 baris), dari 23 sampai 28 Juni 2026. Dari jeda waktunya, data terbagi jadi empat sesi.</w:t>
+        <w:t>Data diambil langsung dari kedua perangkat melalui koneksi adb (aplikasi versi rilis): berkas CSV hasil ekspor disalin dari folder Download. Smartwatch yang digunakan adalah Samsung Galaxy Watch (SM-R860), dan ponselnya Xiaomi Redmi Note 10 Pro. Berkas mentahnya bernama watch-2026-06-28.csv (45.446 baris) dan phone-2026-06-28.csv (42.562 baris), mencakup tanggal 23 sampai 28 Juni 2026. Berdasarkan jeda waktunya, data terbagi menjadi empat sesi.</w:t>
       </w:r>
     </w:p>
     <w:p>
@@ -40,12 +40,12 @@
           <w:b/>
           <w:sz w:val="24"/>
         </w:rPr>
-        <w:t>Membuang Data Saat Jam Tidak Dipakai</w:t>
+        <w:t>Membuang Data Saat Smartwatch Tidak Dipakai</w:t>
       </w:r>
     </w:p>
     <w:p>
       <w:r>
-        <w:t>Hampir separuh data (22.231 baris) ternyata tidak berguna: nilainya beku di 106 dengan kontak jelek (accuracy ≤0). Ini terjadi saat jam dilepas tapi aplikasinya masih merekam. Karena bukan detak jantung asli, data ini dibuang dari hitungan. Sisanya, yaitu data pengukuran yang benar, ada 23.215 baris. Patokan membuang: tiap sesi dipotong sampai data berkontak bagus (accuracy=3) yang terakhir.</w:t>
+        <w:t>Hampir separuh data (22.231 baris) ternyata tidak valid: nilainya beku di angka 106 dengan kontak buruk (accuracy ≤ 0). Kondisi ini terjadi saat smartwatch dilepas, tetapi aplikasinya masih merekam. Karena bukan detak jantung yang sebenarnya, data ini dikeluarkan dari perhitungan. Sisanya, yaitu data pengukuran yang sah, berjumlah 23.215 baris. Patokan pemotongannya: setiap sesi dipotong sampai data dengan kontak baik (accuracy = 3) yang terakhir.</w:t>
       </w:r>
     </w:p>
     <w:p>
@@ -59,7 +59,19 @@
     </w:p>
     <w:p>
       <w:r>
-        <w:t>Hasil tiap sesi ada di Tabel 1 dan Gambar 1–2. Totalnya, smartwatch merekam 23.215 data dan 20.455 di antaranya sampai ke HP (berhasil 88,11%) tanpa data dobel. Yang penting: data yang hilang TIDAK merata. Saat Bluetooth tersambung, hampir tidak ada yang hilang (misalnya setelah HP menyambung di sesi besar sekitar jam 15:00, hampir 100% sampai). Yang hilang justru menumpuk saat HP sedang TIDAK tersambung — termasuk satu sesi pendek yang HP-nya tak pernah menyambung, jadi 100% datanya tidak tersimpan. Selain itu, semua data yang sampai isinya sama persis dengan catatan jam (nilai bpm dan akurasi), jadi tidak ada data yang rusak di perjalanan.</w:t>
+        <w:t>Hasil pengiriman pada setiap sesi dirangkum pada Tabel 1.</w:t>
+      </w:r>
+    </w:p>
+    <w:p>
+      <w:pPr>
+        <w:jc w:val="center"/>
+      </w:pPr>
+      <w:r>
+        <w:rPr>
+          <w:i/>
+          <w:sz w:val="20"/>
+        </w:rPr>
+        <w:t>Tabel 1. Hasil pengiriman per sesi (periode pengukuran).</w:t>
       </w:r>
     </w:p>
     <w:tbl>
@@ -553,15 +565,13 @@
       </w:tr>
     </w:tbl>
     <w:p>
-      <w:pPr>
-        <w:jc w:val="center"/>
-      </w:pPr>
       <w:r>
-        <w:rPr>
-          <w:i/>
-          <w:sz w:val="20"/>
-        </w:rPr>
-        <w:t>Tabel 1. Hasil pengiriman per sesi (periode pengukuran).</w:t>
+        <w:t>Secara keseluruhan, smartwatch merekam 23.215 data dan 20.455 di antaranya sampai ke ponsel, sehingga tingkat keberhasilannya 88,11% tanpa data ganda. Namun tingkat keberhasilan antar-sesi berbeda cukup jauh: sesi yang ponselnya terhubung penuh mencapai 98–99%, sedangkan satu sesi pendek yang ponselnya tidak pernah terhubung (Sesi 2) kehilangan seluruh datanya.</w:t>
+      </w:r>
+    </w:p>
+    <w:p>
+      <w:r>
+        <w:t>Perbandingan jumlah data yang sampai dan yang hilang pada tiap sesi ditampilkan pada Gambar 1.</w:t>
       </w:r>
     </w:p>
     <w:p>
@@ -580,11 +590,11 @@
               <a:graphicData uri="http://schemas.openxmlformats.org/drawingml/2006/picture">
                 <pic:pic>
                   <pic:nvPicPr>
-                    <pic:cNvPr id="0" name="fig_hr_completeness.png"/>
+                    <pic:cNvPr id="0" name="image.png"/>
                     <pic:cNvPicPr/>
                   </pic:nvPicPr>
                   <pic:blipFill>
-                    <a:blip r:embed="rId11"/>
+                    <a:blip r:embed="rId6"/>
                     <a:stretch>
                       <a:fillRect/>
                     </a:stretch>
@@ -612,7 +622,17 @@
           <w:i/>
           <w:sz w:val="20"/>
         </w:rPr>
-        <w:t>Gambar 1. Kelengkapan data tiap sesi (yang sampai vs yang hilang).</w:t>
+        <w:t>Gambar 1. Kelengkapan data tiap sesi (data yang sampai dibanding yang hilang).</w:t>
+      </w:r>
+    </w:p>
+    <w:p>
+      <w:r>
+        <w:t>Dari gambar terlihat bahwa kehilangan paling banyak terjadi pada sesi besar (Sesi 3) dan sesi yang gagal terhubung (Sesi 2), sementara sesi lainnya hampir lengkap.</w:t>
+      </w:r>
+    </w:p>
+    <w:p>
+      <w:r>
+        <w:t>Pola kehilangan data terhadap waktu pada sesi besar ditunjukkan pada Gambar 2.</w:t>
       </w:r>
     </w:p>
     <w:p>
@@ -631,11 +651,11 @@
               <a:graphicData uri="http://schemas.openxmlformats.org/drawingml/2006/picture">
                 <pic:pic>
                   <pic:nvPicPr>
-                    <pic:cNvPr id="0" name="fig_hr_timeline.png"/>
+                    <pic:cNvPr id="0" name="image.png"/>
                     <pic:cNvPicPr/>
                   </pic:nvPicPr>
                   <pic:blipFill>
-                    <a:blip r:embed="rId12"/>
+                    <a:blip r:embed="rId7"/>
                     <a:stretch>
                       <a:fillRect/>
                     </a:stretch>
@@ -663,7 +683,12 @@
           <w:i/>
           <w:sz w:val="20"/>
         </w:rPr>
-        <w:t>Gambar 2. Grafik detak jantung dan titik data hilang di sesi besar; data hanya hilang sebelum HP tersambung.</w:t>
+        <w:t>Gambar 2. Grafik detak jantung dan titik data yang hilang pada sesi besar.</w:t>
+      </w:r>
+    </w:p>
+    <w:p>
+      <w:r>
+        <w:t>Grafik ini memperjelas bahwa kehilangan hanya terjadi di awal, yaitu sebelum ponsel terhubung sekitar pukul 15.00. Setelah terhubung, hampir tidak ada data yang hilang. Selain itu, semua data yang sampai memiliki isi yang sama persis dengan catatan smartwatch (nilai bpm dan akurasi), sehingga tidak ada data yang rusak selama pengiriman.</w:t>
       </w:r>
     </w:p>
     <w:p>
@@ -677,7 +702,19 @@
     </w:p>
     <w:p>
       <w:r>
-        <w:t>Pada data pengukuran yang benar, 90,8% punya kontak bagus (accuracy 3); sisanya 9,1% tanpa kontak (-1) dan 0,1% kontak sedang (0) — lihat Tabel 2. Untuk data berkontak bagus (21.087 baris): detak terendah 60 bpm, tertinggi 123 bpm, dan rata-rata 83,4 bpm.</w:t>
+        <w:t>Sebaran kualitas kontak sensor pada data pengukuran dirangkum pada Tabel 2.</w:t>
+      </w:r>
+    </w:p>
+    <w:p>
+      <w:pPr>
+        <w:jc w:val="center"/>
+      </w:pPr>
+      <w:r>
+        <w:rPr>
+          <w:i/>
+          <w:sz w:val="20"/>
+        </w:rPr>
+        <w:t>Tabel 2. Distribusi nilai akurasi sensor (periode pengukuran).</w:t>
       </w:r>
     </w:p>
     <w:tbl>
@@ -871,15 +908,8 @@
       </w:tr>
     </w:tbl>
     <w:p>
-      <w:pPr>
-        <w:jc w:val="center"/>
-      </w:pPr>
       <w:r>
-        <w:rPr>
-          <w:i/>
-          <w:sz w:val="20"/>
-        </w:rPr>
-        <w:t>Tabel 2. Distribusi nilai akurasi sensor (periode pengukuran).</w:t>
+        <w:t>Sebagian besar data (90,8%) memiliki kontak baik (accuracy 3); sisanya 9,1% tanpa kontak (-1) dan 0,1% kontak sedang (0). Untuk data dengan kontak baik (21.087 baris), detak jantung terendah 60 bpm, tertinggi 123 bpm, dan rata-rata 83,4 bpm.</w:t>
       </w:r>
     </w:p>
     <w:p>
@@ -888,22 +918,22 @@
           <w:b/>
           <w:sz w:val="24"/>
         </w:rPr>
-        <w:t>TEMUAN PENTING — Data Lama Tidak Dikirim Ulang Saat Putus-Sambung</w:t>
+        <w:t>TEMUAN PENTING — Data Tidak Dikirim Ulang Saat Koneksi Putus-Sambung</w:t>
       </w:r>
     </w:p>
     <w:p>
       <w:r>
-        <w:t>Temuan ini melengkapi catatan 26 Juni (bagian ACK dan store-and-forward). Saat dibandingkan, ada 2.879 data yang DITANDAI “sudah terkirim” (synced = 1) oleh jam, tapi sebenarnya TIDAK ADA di HP. Hanya 5 data terakhir yang memang masih antre (itu wajar). Semua 2.879 data tadi hilang pada saat HP sedang putus sambungan.</w:t>
+        <w:t>Temuan ini melengkapi catatan 26 Juni (bagian ACK dan store-and-forward). Setelah dibandingkan, terdapat 2.879 data yang ditandai “sudah terkirim” (synced = 1) oleh smartwatch, tetapi sebenarnya tidak ada di ponsel. Hanya 5 data terakhir yang memang masih dalam antrean, dan itu wajar. Seluruh 2.879 data tersebut hilang ketika ponsel sedang terputus.</w:t>
       </w:r>
     </w:p>
     <w:p>
       <w:r>
-        <w:t>Artinya: saat ini jam menandai “terkirim” begitu data dikirim, belum benar-benar menunggu balasan (ACK) dari HP ketika koneksi putus. Akibatnya, data yang menumpuk selama putus tidak otomatis dikirim ulang saat tersambung lagi. Jadi mekanismenya bagus SELAMA tersambung, tapi belum tahan saat putus-sambung.</w:t>
+        <w:t>Artinya, untuk saat ini smartwatch menandai data “terkirim” begitu data dikirim, belum benar-benar menunggu balasan (ACK) dari ponsel ketika koneksi terputus. Akibatnya, data yang menumpuk selama koneksi terputus tidak otomatis dikirim ulang saat tersambung kembali. Dengan kata lain, mekanisme ini bekerja baik selama koneksi tersambung, tetapi belum tahan terhadap kondisi putus-sambung.</w:t>
       </w:r>
     </w:p>
     <w:p>
       <w:r>
-        <w:t>Saran perbaikan: (1) jangan tandai “terkirim” sebelum balasan ACK benar-benar diterima; (2) tambahkan proses kirim-ulang otomatis yang mengecek data belum-terkonfirmasi setiap kali tersambung kembali; (3) bisa pakai tiga status: belum dikirim / sudah dikirim tapi belum dibalas / sudah dipastikan. Intinya, balasan di tingkat aplikasi (ACK) lebih bisa diandalkan daripada hanya mengandalkan notifikasi BLE.</w:t>
+        <w:t>Saran perbaikan: (1) jangan menandai data “terkirim” sebelum balasan ACK benar-benar diterima; (2) tambahkan proses kirim ulang otomatis yang memeriksa data yang belum terkonfirmasi setiap kali koneksi tersambung kembali; (3) gunakan tiga status, yaitu belum dikirim, sudah dikirim tetapi belum dibalas, dan sudah dipastikan. Intinya, konfirmasi pada tingkat aplikasi (ACK) lebih dapat diandalkan daripada hanya mengandalkan notifikasi BLE.</w:t>
       </w:r>
     </w:p>
     <w:p>
@@ -912,12 +942,12 @@
           <w:b/>
           <w:sz w:val="24"/>
         </w:rPr>
-        <w:t>Yang Sudah Diubah di Naskah</w:t>
+        <w:t>Perubahan pada Naskah</w:t>
       </w:r>
     </w:p>
     <w:p>
       <w:r>
-        <w:t>Kedua draf naskah (Indonesia dan Inggris) sudah diperbarui dengan data ini: Tabel 2 menjadi hasil per sesi, Tabel 3 (akurasi), tambahan ukuran kesamaan nilai (fidelity), subbab baru 3.5 soal temuan kirim-ulang ini, plus Gambar 6–9. Angka utama berubah: dari delivery 99,86% (satu sesi lama) menjadi “isi data 100% sama dan hampir tidak ada yang hilang saat tersambung”, dengan angka gabungan 88,1% yang justru memperlihatkan kelemahan kirim-ulang tadi. Skrip analisisnya: hr_analysis/make_figs.py.</w:t>
+        <w:t>Kedua draf naskah (versi Indonesia dan Inggris) telah diperbarui dengan data ini: Tabel 2 menjadi hasil per sesi, Tabel 3 berisi distribusi akurasi, ditambahkan ukuran kesamaan nilai (fidelity), serta subbab baru 3.5 mengenai temuan kirim ulang ini, dilengkapi Gambar 6–9. Angka utama berubah: dari delivery 99,86% (satu sesi lama) menjadi isi data 100% sama dan hampir tidak ada yang hilang saat koneksi tersambung, dengan angka gabungan 88,1% yang justru memperlihatkan kelemahan kirim ulang tersebut. Skrip analisisnya: hr_analysis/make_figs.py.</w:t>
       </w:r>
     </w:p>
     <w:sectPr>

</xml_diff>